<commit_message>
Agrega recuadro de logo y datos de empresa en todas las plantillas (Excel y Word)
Co-Authored-By: Claude Sonnet 5.5 <noreply@anthropic.com>
Claude-Session: https://claude.ai/code/session_01FbwLCqGiq6yuWgXYoX8NSd
</commit_message>
<xml_diff>
--- a/plantillas/5_Documentos_Word/01_Contrato_de_Prestacion_de_Servicios.docx
+++ b/plantillas/5_Documentos_Word/01_Contrato_de_Prestacion_de_Servicios.docx
@@ -2,6 +2,125 @@
 <file path=word/document.xml><?xml version="1.0" encoding="utf-8"?>
 <w:document xmlns:wpc="http://schemas.microsoft.com/office/word/2010/wordprocessingCanvas" xmlns:mo="http://schemas.microsoft.com/office/mac/office/2008/main" xmlns:mc="http://schemas.openxmlformats.org/markup-compatibility/2006" xmlns:mv="urn:schemas-microsoft-com:mac:vml" xmlns:o="urn:schemas-microsoft-com:office:office" xmlns:r="http://schemas.openxmlformats.org/officeDocument/2006/relationships" xmlns:m="http://schemas.openxmlformats.org/officeDocument/2006/math" xmlns:v="urn:schemas-microsoft-com:vml" xmlns:wp14="http://schemas.microsoft.com/office/word/2010/wordprocessingDrawing" xmlns:wp="http://schemas.openxmlformats.org/drawingml/2006/wordprocessingDrawing" xmlns:w10="urn:schemas-microsoft-com:office:word" xmlns:w="http://schemas.openxmlformats.org/wordprocessingml/2006/main" xmlns:w14="http://schemas.microsoft.com/office/word/2010/wordml" xmlns:wpg="http://schemas.microsoft.com/office/word/2010/wordprocessingGroup" xmlns:wpi="http://schemas.microsoft.com/office/word/2010/wordprocessingInk" xmlns:wne="http://schemas.microsoft.com/office/word/2006/wordml" xmlns:wps="http://schemas.microsoft.com/office/word/2010/wordprocessingShape" mc:Ignorable="w14 wp14">
   <w:body>
+    <w:tbl>
+      <w:tblPr>
+        <w:tblStyle w:val="TableGrid"/>
+        <w:tblW w:type="auto" w:w="0"/>
+        <w:jc w:val="center"/>
+        <w:tblLook w:firstColumn="1" w:firstRow="1" w:lastColumn="0" w:lastRow="0" w:noHBand="0" w:noVBand="1" w:val="04A0"/>
+      </w:tblPr>
+      <w:tblGrid>
+        <w:gridCol w:w="4703"/>
+        <w:gridCol w:w="4703"/>
+      </w:tblGrid>
+      <w:tr>
+        <w:tc>
+          <w:tcPr>
+            <w:tcW w:type="dxa" w:w="2551"/>
+          </w:tcPr>
+          <w:p>
+            <w:pPr>
+              <w:jc w:val="center"/>
+            </w:pPr>
+            <w:r/>
+            <w:r>
+              <w:rPr>
+                <w:i/>
+                <w:color w:val="A6A6A6"/>
+                <w:sz w:val="16"/>
+              </w:rPr>
+              <w:br/>
+              <w:t>INSERTE SU LOGO</w:t>
+              <w:br/>
+              <w:t>(Insertar &gt; Imágenes)</w:t>
+              <w:br/>
+            </w:r>
+          </w:p>
+        </w:tc>
+        <w:tc>
+          <w:tcPr>
+            <w:tcW w:type="dxa" w:w="6803"/>
+          </w:tcPr>
+          <w:p>
+            <w:r>
+              <w:rPr>
+                <w:b/>
+              </w:rPr>
+            </w:r>
+            <w:r>
+              <w:rPr>
+                <w:b w:val="0"/>
+                <w:highlight w:val="yellow"/>
+              </w:rPr>
+              <w:t>[NOMBRE DE SU EMPRESA]</w:t>
+            </w:r>
+          </w:p>
+          <w:p>
+            <w:r>
+              <w:rPr>
+                <w:b w:val="0"/>
+                <w:sz w:val="18"/>
+              </w:rPr>
+              <w:t xml:space="preserve">RFC: </w:t>
+            </w:r>
+            <w:r>
+              <w:rPr>
+                <w:b w:val="0"/>
+                <w:sz w:val="18"/>
+                <w:highlight w:val="yellow"/>
+              </w:rPr>
+              <w:t>[RFC]</w:t>
+            </w:r>
+            <w:r>
+              <w:rPr>
+                <w:b w:val="0"/>
+                <w:sz w:val="18"/>
+              </w:rPr>
+              <w:t xml:space="preserve">  ·  Tel.: </w:t>
+            </w:r>
+            <w:r>
+              <w:rPr>
+                <w:b w:val="0"/>
+                <w:sz w:val="18"/>
+                <w:highlight w:val="yellow"/>
+              </w:rPr>
+              <w:t>[TELÉFONO]</w:t>
+            </w:r>
+            <w:r>
+              <w:rPr>
+                <w:b w:val="0"/>
+                <w:sz w:val="18"/>
+              </w:rPr>
+              <w:br/>
+            </w:r>
+            <w:r>
+              <w:rPr>
+                <w:b w:val="0"/>
+                <w:sz w:val="18"/>
+                <w:highlight w:val="yellow"/>
+              </w:rPr>
+              <w:t>[DIRECCIÓN]</w:t>
+            </w:r>
+            <w:r>
+              <w:rPr>
+                <w:b w:val="0"/>
+                <w:sz w:val="18"/>
+              </w:rPr>
+              <w:t xml:space="preserve">  ·  </w:t>
+            </w:r>
+            <w:r>
+              <w:rPr>
+                <w:b w:val="0"/>
+                <w:sz w:val="18"/>
+                <w:highlight w:val="yellow"/>
+              </w:rPr>
+              <w:t>[CORREO / SITIO WEB]</w:t>
+            </w:r>
+          </w:p>
+        </w:tc>
+      </w:tr>
+    </w:tbl>
+    <w:p/>
     <w:p>
       <w:pPr>
         <w:jc w:val="center"/>

</xml_diff>

<commit_message>
Rediseño con estilo ejecutivo Grupo Canville: portada en cada Excel, paleta azul/petróleo/dorado, pie de página, portadas de venta con collage
Corrige evaluación de desempeño que mostraba 'Deficiente' vacía.

Co-Authored-By: Claude Sonnet 5.5 <noreply@anthropic.com>
Claude-Session: https://claude.ai/code/session_01FbwLCqGiq6yuWgXYoX8NSd
</commit_message>
<xml_diff>
--- a/plantillas/5_Documentos_Word/01_Contrato_de_Prestacion_de_Servicios.docx
+++ b/plantillas/5_Documentos_Word/01_Contrato_de_Prestacion_de_Servicios.docx
@@ -4,7 +4,6 @@
   <w:body>
     <w:tbl>
       <w:tblPr>
-        <w:tblStyle w:val="TableGrid"/>
         <w:tblW w:type="auto" w:w="0"/>
         <w:jc w:val="center"/>
         <w:tblLook w:firstColumn="1" w:firstRow="1" w:lastColumn="0" w:lastRow="0" w:noHBand="0" w:noVBand="1" w:val="04A0"/>
@@ -14,9 +13,18 @@
         <w:gridCol w:w="4703"/>
       </w:tblGrid>
       <w:tr>
+        <w:trPr>
+          <w:trHeight w:val="1300"/>
+        </w:trPr>
         <w:tc>
           <w:tcPr>
             <w:tcW w:type="dxa" w:w="2551"/>
+            <w:tcBorders>
+              <w:top w:val="dashed" w:sz="6" w:color="A6B3BF"/>
+              <w:left w:val="dashed" w:sz="6" w:color="A6B3BF"/>
+              <w:bottom w:val="dashed" w:sz="6" w:color="A6B3BF"/>
+              <w:right w:val="dashed" w:sz="6" w:color="A6B3BF"/>
+            </w:tcBorders>
           </w:tcPr>
           <w:p>
             <w:pPr>
@@ -25,26 +33,34 @@
             <w:r/>
             <w:r>
               <w:rPr>
-                <w:i/>
-                <w:color w:val="A6A6A6"/>
+                <w:color w:val="A6B3BF"/>
                 <w:sz w:val="16"/>
               </w:rPr>
               <w:br/>
               <w:t>INSERTE SU LOGO</w:t>
               <w:br/>
               <w:t>(Insertar &gt; Imágenes)</w:t>
-              <w:br/>
             </w:r>
           </w:p>
         </w:tc>
         <w:tc>
           <w:tcPr>
             <w:tcW w:type="dxa" w:w="6803"/>
+            <w:tcBorders>
+              <w:top w:val="nil"/>
+              <w:left w:val="nil"/>
+              <w:bottom w:val="single" w:sz="6" w:color="C9D3DB"/>
+              <w:right w:val="nil"/>
+            </w:tcBorders>
           </w:tcPr>
           <w:p>
+            <w:pPr>
+              <w:ind w:left="227"/>
+            </w:pPr>
             <w:r>
               <w:rPr>
                 <w:b/>
+                <w:sz w:val="26"/>
               </w:rPr>
             </w:r>
             <w:r>
@@ -56,9 +72,13 @@
             </w:r>
           </w:p>
           <w:p>
+            <w:pPr>
+              <w:ind w:left="227"/>
+            </w:pPr>
             <w:r>
               <w:rPr>
                 <w:b w:val="0"/>
+                <w:color w:val="5B6B78"/>
                 <w:sz w:val="18"/>
               </w:rPr>
               <w:t xml:space="preserve">RFC: </w:t>
@@ -66,6 +86,7 @@
             <w:r>
               <w:rPr>
                 <w:b w:val="0"/>
+                <w:color w:val="5B6B78"/>
                 <w:sz w:val="18"/>
                 <w:highlight w:val="yellow"/>
               </w:rPr>
@@ -74,6 +95,7 @@
             <w:r>
               <w:rPr>
                 <w:b w:val="0"/>
+                <w:color w:val="5B6B78"/>
                 <w:sz w:val="18"/>
               </w:rPr>
               <w:t xml:space="preserve">  ·  Tel.: </w:t>
@@ -81,6 +103,7 @@
             <w:r>
               <w:rPr>
                 <w:b w:val="0"/>
+                <w:color w:val="5B6B78"/>
                 <w:sz w:val="18"/>
                 <w:highlight w:val="yellow"/>
               </w:rPr>
@@ -89,6 +112,7 @@
             <w:r>
               <w:rPr>
                 <w:b w:val="0"/>
+                <w:color w:val="5B6B78"/>
                 <w:sz w:val="18"/>
               </w:rPr>
               <w:br/>
@@ -96,6 +120,7 @@
             <w:r>
               <w:rPr>
                 <w:b w:val="0"/>
+                <w:color w:val="5B6B78"/>
                 <w:sz w:val="18"/>
                 <w:highlight w:val="yellow"/>
               </w:rPr>
@@ -104,6 +129,7 @@
             <w:r>
               <w:rPr>
                 <w:b w:val="0"/>
+                <w:color w:val="5B6B78"/>
                 <w:sz w:val="18"/>
               </w:rPr>
               <w:t xml:space="preserve">  ·  </w:t>
@@ -111,6 +137,7 @@
             <w:r>
               <w:rPr>
                 <w:b w:val="0"/>
+                <w:color w:val="5B6B78"/>
                 <w:sz w:val="18"/>
                 <w:highlight w:val="yellow"/>
               </w:rPr>
@@ -123,13 +150,17 @@
     <w:p/>
     <w:p>
       <w:pPr>
+        <w:spacing w:after="200"/>
         <w:jc w:val="center"/>
+        <w:pBdr>
+          <w:bottom w:val="single" w:sz="12" w:space="4" w:color="C9A227"/>
+        </w:pBdr>
       </w:pPr>
       <w:r>
         <w:rPr>
           <w:b/>
-          <w:color w:val="1F4E78"/>
-          <w:sz w:val="32"/>
+          <w:color w:val="0B2A4A"/>
+          <w:sz w:val="36"/>
         </w:rPr>
         <w:t>CONTRATO DE PRESTACIÓN DE SERVICIOS PROFESIONALES</w:t>
       </w:r>
@@ -238,11 +269,13 @@
     </w:p>
     <w:p>
       <w:pPr>
+        <w:spacing w:before="160"/>
         <w:jc w:val="center"/>
       </w:pPr>
       <w:r>
         <w:rPr>
           <w:b/>
+          <w:color w:val="1B6B73"/>
         </w:rPr>
         <w:t>DECLARACIONES</w:t>
       </w:r>
@@ -271,11 +304,13 @@
     </w:p>
     <w:p>
       <w:pPr>
+        <w:spacing w:before="160"/>
         <w:jc w:val="center"/>
       </w:pPr>
       <w:r>
         <w:rPr>
           <w:b/>
+          <w:color w:val="1B6B73"/>
         </w:rPr>
         <w:t>CLÁUSULAS</w:t>
       </w:r>
@@ -287,6 +322,7 @@
       <w:r>
         <w:rPr>
           <w:b/>
+          <w:color w:val="0B2A4A"/>
         </w:rPr>
         <w:t xml:space="preserve">PRIMERA. Objeto. </w:t>
       </w:r>
@@ -317,6 +353,7 @@
       <w:r>
         <w:rPr>
           <w:b/>
+          <w:color w:val="0B2A4A"/>
         </w:rPr>
         <w:t xml:space="preserve">SEGUNDA. Vigencia. </w:t>
       </w:r>
@@ -360,6 +397,7 @@
       <w:r>
         <w:rPr>
           <w:b/>
+          <w:color w:val="0B2A4A"/>
         </w:rPr>
         <w:t xml:space="preserve">TERCERA. Honorarios. </w:t>
       </w:r>
@@ -416,6 +454,7 @@
       <w:r>
         <w:rPr>
           <w:b/>
+          <w:color w:val="0B2A4A"/>
         </w:rPr>
         <w:t xml:space="preserve">CUARTA. Obligaciones del prestador. </w:t>
       </w:r>
@@ -433,6 +472,7 @@
       <w:r>
         <w:rPr>
           <w:b/>
+          <w:color w:val="0B2A4A"/>
         </w:rPr>
         <w:t xml:space="preserve">QUINTA. Obligaciones del cliente. </w:t>
       </w:r>
@@ -450,6 +490,7 @@
       <w:r>
         <w:rPr>
           <w:b/>
+          <w:color w:val="0B2A4A"/>
         </w:rPr>
         <w:t xml:space="preserve">SEXTA. Relación de las partes. </w:t>
       </w:r>
@@ -467,6 +508,7 @@
       <w:r>
         <w:rPr>
           <w:b/>
+          <w:color w:val="0B2A4A"/>
         </w:rPr>
         <w:t xml:space="preserve">SÉPTIMA. Confidencialidad. </w:t>
       </w:r>
@@ -497,6 +539,7 @@
       <w:r>
         <w:rPr>
           <w:b/>
+          <w:color w:val="0B2A4A"/>
         </w:rPr>
         <w:t xml:space="preserve">OCTAVA. Propiedad intelectual. </w:t>
       </w:r>
@@ -527,6 +570,7 @@
       <w:r>
         <w:rPr>
           <w:b/>
+          <w:color w:val="0B2A4A"/>
         </w:rPr>
         <w:t xml:space="preserve">NOVENA. Terminación. </w:t>
       </w:r>
@@ -557,6 +601,7 @@
       <w:r>
         <w:rPr>
           <w:b/>
+          <w:color w:val="0B2A4A"/>
         </w:rPr>
         <w:t xml:space="preserve">DÉCIMA. Pena convencional. </w:t>
       </w:r>
@@ -587,6 +632,7 @@
       <w:r>
         <w:rPr>
           <w:b/>
+          <w:color w:val="0B2A4A"/>
         </w:rPr>
         <w:t xml:space="preserve">DÉCIMA PRIMERA. Jurisdicción. </w:t>
       </w:r>
@@ -760,6 +806,7 @@
       </w:r>
     </w:p>
     <w:sectPr>
+      <w:footerReference w:type="default" r:id="rId9"/>
       <w:pgSz w:w="12240" w:h="15840"/>
       <w:pgMar w:top="1304" w:right="1417" w:bottom="1304" w:left="1417" w:header="720" w:footer="720" w:gutter="0"/>
       <w:cols w:space="720"/>
@@ -767,6 +814,49 @@
     </w:sectPr>
   </w:body>
 </w:document>
+</file>
+
+<file path=word/footer1.xml><?xml version="1.0" encoding="utf-8"?>
+<w:ftr xmlns:m="http://schemas.openxmlformats.org/officeDocument/2006/math" xmlns:mc="http://schemas.openxmlformats.org/markup-compatibility/2006" xmlns:mo="http://schemas.microsoft.com/office/mac/office/2008/main" xmlns:mv="urn:schemas-microsoft-com:mac:vml" xmlns:o="urn:schemas-microsoft-com:office:office" xmlns:r="http://schemas.openxmlformats.org/officeDocument/2006/relationships" xmlns:v="urn:schemas-microsoft-com:vml" xmlns:w10="urn:schemas-microsoft-com:office:word" xmlns:w14="http://schemas.microsoft.com/office/word/2010/wordml" xmlns:w="http://schemas.openxmlformats.org/wordprocessingml/2006/main" xmlns:wne="http://schemas.microsoft.com/office/word/2006/wordml" xmlns:wp14="http://schemas.microsoft.com/office/word/2010/wordprocessingDrawing" xmlns:wp="http://schemas.openxmlformats.org/drawingml/2006/wordprocessingDrawing" xmlns:wpc="http://schemas.microsoft.com/office/word/2010/wordprocessingCanvas" xmlns:wpg="http://schemas.microsoft.com/office/word/2010/wordprocessingGroup" xmlns:wpi="http://schemas.microsoft.com/office/word/2010/wordprocessingInk" xmlns:wps="http://schemas.microsoft.com/office/word/2010/wordprocessingShape" mc:Ignorable="w14 wp14">
+  <w:p>
+    <w:pPr>
+      <w:pStyle w:val="Footer"/>
+      <w:jc w:val="center"/>
+    </w:pPr>
+    <w:r>
+      <w:rPr>
+        <w:color w:val="5B6B78"/>
+        <w:sz w:val="16"/>
+      </w:rPr>
+      <w:t xml:space="preserve">Página </w:t>
+    </w:r>
+    <w:r>
+      <w:rPr>
+        <w:color w:val="5B6B78"/>
+        <w:sz w:val="16"/>
+      </w:rPr>
+      <w:fldChar w:fldCharType="begin"/>
+      <w:instrText xml:space="preserve">PAGE</w:instrText>
+      <w:fldChar w:fldCharType="end"/>
+    </w:r>
+    <w:r>
+      <w:rPr>
+        <w:color w:val="5B6B78"/>
+        <w:sz w:val="16"/>
+      </w:rPr>
+      <w:t xml:space="preserve"> de </w:t>
+    </w:r>
+    <w:r>
+      <w:rPr>
+        <w:color w:val="5B6B78"/>
+        <w:sz w:val="16"/>
+      </w:rPr>
+      <w:fldChar w:fldCharType="begin"/>
+      <w:instrText xml:space="preserve">NUMPAGES</w:instrText>
+      <w:fldChar w:fldCharType="end"/>
+    </w:r>
+  </w:p>
+</w:ftr>
 </file>
 
 <file path=word/numbering.xml><?xml version="1.0" encoding="utf-8"?>
@@ -1133,10 +1223,11 @@
     <w:qFormat/>
     <w:rsid w:val="00FC693F"/>
     <w:pPr>
-      <w:spacing w:after="120"/>
+      <w:spacing w:after="160" w:line="276" w:lineRule="auto"/>
     </w:pPr>
     <w:rPr>
       <w:rFonts w:ascii="Calibri" w:hAnsi="Calibri" w:eastAsia="Calibri"/>
+      <w:color w:val="2B2B2B"/>
       <w:sz w:val="22"/>
     </w:rPr>
   </w:style>
@@ -1176,6 +1267,10 @@
       </w:tabs>
       <w:spacing w:after="0" w:line="240" w:lineRule="auto"/>
     </w:pPr>
+    <w:rPr>
+      <w:color w:val="5B6B78"/>
+      <w:sz w:val="16"/>
+    </w:rPr>
   </w:style>
   <w:style w:type="character" w:customStyle="1" w:styleId="FooterChar">
     <w:name w:val="Footer Char"/>

</xml_diff>

<commit_message>
Versión 2.0: fuente Abadi, mayúsculas, portada y ayuda en cada Excel, catálogos editables, conciliación rediseñada, 14 tableros con gráficas, 6 políticas y procedimientos en Word, portadas de venta rediseñadas y por producto
Co-Authored-By: Claude Sonnet 5.5 <noreply@anthropic.com>
Claude-Session: https://claude.ai/code/session_01FbwLCqGiq6yuWgXYoX8NSd
</commit_message>
<xml_diff>
--- a/plantillas/5_Documentos_Word/01_Contrato_de_Prestacion_de_Servicios.docx
+++ b/plantillas/5_Documentos_Word/01_Contrato_de_Prestacion_de_Servicios.docx
@@ -324,7 +324,7 @@
           <w:b/>
           <w:color w:val="0B2A4A"/>
         </w:rPr>
-        <w:t xml:space="preserve">PRIMERA. Objeto. </w:t>
+        <w:t xml:space="preserve">PRIMERA. OBJETO. </w:t>
       </w:r>
       <w:r>
         <w:rPr>
@@ -355,7 +355,7 @@
           <w:b/>
           <w:color w:val="0B2A4A"/>
         </w:rPr>
-        <w:t xml:space="preserve">SEGUNDA. Vigencia. </w:t>
+        <w:t xml:space="preserve">SEGUNDA. VIGENCIA. </w:t>
       </w:r>
       <w:r>
         <w:rPr>
@@ -399,7 +399,7 @@
           <w:b/>
           <w:color w:val="0B2A4A"/>
         </w:rPr>
-        <w:t xml:space="preserve">TERCERA. Honorarios. </w:t>
+        <w:t xml:space="preserve">TERCERA. HONORARIOS. </w:t>
       </w:r>
       <w:r>
         <w:rPr>
@@ -456,7 +456,7 @@
           <w:b/>
           <w:color w:val="0B2A4A"/>
         </w:rPr>
-        <w:t xml:space="preserve">CUARTA. Obligaciones del prestador. </w:t>
+        <w:t xml:space="preserve">CUARTA. OBLIGACIONES DEL PRESTADOR. </w:t>
       </w:r>
       <w:r>
         <w:rPr>
@@ -474,7 +474,7 @@
           <w:b/>
           <w:color w:val="0B2A4A"/>
         </w:rPr>
-        <w:t xml:space="preserve">QUINTA. Obligaciones del cliente. </w:t>
+        <w:t xml:space="preserve">QUINTA. OBLIGACIONES DEL CLIENTE. </w:t>
       </w:r>
       <w:r>
         <w:rPr>
@@ -492,7 +492,7 @@
           <w:b/>
           <w:color w:val="0B2A4A"/>
         </w:rPr>
-        <w:t xml:space="preserve">SEXTA. Relación de las partes. </w:t>
+        <w:t xml:space="preserve">SEXTA. RELACIÓN DE LAS PARTES. </w:t>
       </w:r>
       <w:r>
         <w:rPr>
@@ -510,7 +510,7 @@
           <w:b/>
           <w:color w:val="0B2A4A"/>
         </w:rPr>
-        <w:t xml:space="preserve">SÉPTIMA. Confidencialidad. </w:t>
+        <w:t xml:space="preserve">SÉPTIMA. CONFIDENCIALIDAD. </w:t>
       </w:r>
       <w:r>
         <w:rPr>
@@ -541,7 +541,7 @@
           <w:b/>
           <w:color w:val="0B2A4A"/>
         </w:rPr>
-        <w:t xml:space="preserve">OCTAVA. Propiedad intelectual. </w:t>
+        <w:t xml:space="preserve">OCTAVA. PROPIEDAD INTELECTUAL. </w:t>
       </w:r>
       <w:r>
         <w:rPr>
@@ -572,7 +572,7 @@
           <w:b/>
           <w:color w:val="0B2A4A"/>
         </w:rPr>
-        <w:t xml:space="preserve">NOVENA. Terminación. </w:t>
+        <w:t xml:space="preserve">NOVENA. TERMINACIÓN. </w:t>
       </w:r>
       <w:r>
         <w:rPr>
@@ -603,7 +603,7 @@
           <w:b/>
           <w:color w:val="0B2A4A"/>
         </w:rPr>
-        <w:t xml:space="preserve">DÉCIMA. Pena convencional. </w:t>
+        <w:t xml:space="preserve">DÉCIMA. PENA CONVENCIONAL. </w:t>
       </w:r>
       <w:r>
         <w:rPr>
@@ -634,7 +634,7 @@
           <w:b/>
           <w:color w:val="0B2A4A"/>
         </w:rPr>
-        <w:t xml:space="preserve">DÉCIMA PRIMERA. Jurisdicción. </w:t>
+        <w:t xml:space="preserve">DÉCIMA PRIMERA. JURISDICCIÓN. </w:t>
       </w:r>
       <w:r>
         <w:rPr>
@@ -1226,7 +1226,7 @@
       <w:spacing w:after="160" w:line="276" w:lineRule="auto"/>
     </w:pPr>
     <w:rPr>
-      <w:rFonts w:ascii="Calibri" w:hAnsi="Calibri" w:eastAsia="Calibri"/>
+      <w:rFonts w:ascii="Abadi" w:hAnsi="Abadi" w:eastAsia="Abadi"/>
       <w:color w:val="2B2B2B"/>
       <w:sz w:val="22"/>
     </w:rPr>

</xml_diff>

<commit_message>
Identidad Grupo Canville completa; libro de control operativo semanal, reporte semanal, plan de 30 días y modelo operativo; presentación comercial (PDF/HTML), infografías, mensajes y guion
Co-Authored-By: Claude Sonnet 5.5 <noreply@anthropic.com>
Claude-Session: https://claude.ai/code/session_01FbwLCqGiq6yuWgXYoX8NSd
</commit_message>
<xml_diff>
--- a/plantillas/5_Documentos_Word/01_Contrato_de_Prestacion_de_Servicios.docx
+++ b/plantillas/5_Documentos_Word/01_Contrato_de_Prestacion_de_Servicios.docx
@@ -275,7 +275,7 @@
       <w:r>
         <w:rPr>
           <w:b/>
-          <w:color w:val="1B6B73"/>
+          <w:color w:val="0E7C8B"/>
         </w:rPr>
         <w:t>DECLARACIONES</w:t>
       </w:r>
@@ -310,7 +310,7 @@
       <w:r>
         <w:rPr>
           <w:b/>
-          <w:color w:val="1B6B73"/>
+          <w:color w:val="0E7C8B"/>
         </w:rPr>
         <w:t>CLÁUSULAS</w:t>
       </w:r>

</xml_diff>